<commit_message>
Gjor kontraktfeltene anker-baserte (robust mot ny opplasting av dokument)
Da provisjonsvedlegget ble lagt til i DocuSign-malen, reprosesserte DocuSign
dokumentet og slettet ALLE felter (tekst OG signatur), saa kontrakten gikk ut
med raa [[...]]-plassholdere og uten signaturfelt.

Loesning: appen plasserer naa tekstfeltene via anchorString paa selve
[[...]]-tekstene ved utsending (config.docusign.anchors + docusign.js), i
stedet for auto-gjenkjente felter med tilfeldige etiketter som forsvinner ved
ny opplasting. Plassholderne er gjort hvite i Word-malen saa de ikke synes bak
verdien, og en signeringsseksjon med ankre ([[SIGN_AG/AT]], [[DATO_AG/AT]]) er
lagt til nederst. Signatur/dato-felt for begge parter ligger paa malen (anker).
Verifisert paa kladd: alle 7 tekstfelt + 2 signaturer + 2 datoer treffer.

Co-Authored-By: Claude Opus 4.8 <noreply@anthropic.com>
</commit_message>
<xml_diff>
--- a/docs/Arbeidsavtale-mal.docx
+++ b/docs/Arbeidsavtale-mal.docx
@@ -334,8 +334,7 @@
               <w:rPr>
                 <w:b/>
                 <w:bCs/>
-                <w:highlight w:val="yellow"/>
-                <w:highlightCs w:val="yellow"/>
+                <w:color w:val="FFFFFF"/>
               </w:rPr>
               <w:t xml:space="preserve">[[NAVN]]</w:t>
             </w:r>
@@ -390,8 +389,7 @@
               <w:rPr>
                 <w:b/>
                 <w:bCs/>
-                <w:highlight w:val="yellow"/>
-                <w:highlightCs w:val="yellow"/>
+                <w:color w:val="FFFFFF"/>
               </w:rPr>
               <w:t xml:space="preserve">[[EPOST]]</w:t>
             </w:r>
@@ -446,8 +444,7 @@
               <w:rPr>
                 <w:b/>
                 <w:bCs/>
-                <w:highlight w:val="yellow"/>
-                <w:highlightCs w:val="yellow"/>
+                <w:color w:val="FFFFFF"/>
               </w:rPr>
               <w:t xml:space="preserve">[[TELEFON]]</w:t>
             </w:r>
@@ -541,8 +538,7 @@
               <w:rPr>
                 <w:b/>
                 <w:bCs/>
-                <w:highlight w:val="yellow"/>
-                <w:highlightCs w:val="yellow"/>
+                <w:color w:val="FFFFFF"/>
               </w:rPr>
               <w:t xml:space="preserve">[[STILLING]]</w:t>
             </w:r>
@@ -597,8 +593,7 @@
               <w:rPr>
                 <w:b/>
                 <w:bCs/>
-                <w:highlight w:val="yellow"/>
-                <w:highlightCs w:val="yellow"/>
+                <w:color w:val="FFFFFF"/>
               </w:rPr>
               <w:t xml:space="preserve">[[STILLINGSDEL]]</w:t>
             </w:r>
@@ -656,8 +651,7 @@
               <w:rPr>
                 <w:b/>
                 <w:bCs/>
-                <w:highlight w:val="yellow"/>
-                <w:highlightCs w:val="yellow"/>
+                <w:color w:val="FFFFFF"/>
               </w:rPr>
               <w:t xml:space="preserve">[[TILTREDELSESDATO]]</w:t>
             </w:r>
@@ -739,8 +733,7 @@
         <w:rPr>
           <w:b/>
           <w:bCs/>
-          <w:highlight w:val="yellow"/>
-          <w:highlightCs w:val="yellow"/>
+          <w:color w:val="FFFFFF"/>
         </w:rPr>
         <w:t xml:space="preserve">[[NAERMESTE_LEDER]]</w:t>
       </w:r>
@@ -1203,6 +1196,74 @@
           <w:color w:val="888888"/>
         </w:rPr>
         <w:t xml:space="preserve">Signering settes opp i DocuSign (Sign Here / Date Signed-felt for Arbeidstaker og Daniel Kolstad) — ikke en del av denne malteksten.</w:t>
+      </w:r>
+    </w:p>
+    <w:p>
+      <w:r>
+        <w:rPr/>
+        <w:t xml:space="preserve"/>
+      </w:r>
+    </w:p>
+    <w:p>
+      <w:r>
+        <w:rPr>
+          <w:b/>
+        </w:rPr>
+        <w:t xml:space="preserve">Signaturer</w:t>
+      </w:r>
+    </w:p>
+    <w:p>
+      <w:r>
+        <w:rPr/>
+        <w:t xml:space="preserve">For Electi Business Partner AS (Arbeidsgiver):</w:t>
+      </w:r>
+    </w:p>
+    <w:p>
+      <w:r>
+        <w:rPr>
+          <w:color w:val="FFFFFF"/>
+        </w:rPr>
+        <w:t xml:space="preserve">[[SIGN_AG]]</w:t>
+      </w:r>
+      <w:r>
+        <w:rPr/>
+        <w:t xml:space="preserve">            </w:t>
+      </w:r>
+      <w:r>
+        <w:rPr>
+          <w:color w:val="FFFFFF"/>
+        </w:rPr>
+        <w:t xml:space="preserve">[[DATO_AG]]</w:t>
+      </w:r>
+    </w:p>
+    <w:p>
+      <w:r>
+        <w:rPr/>
+        <w:t xml:space="preserve"/>
+      </w:r>
+    </w:p>
+    <w:p>
+      <w:r>
+        <w:rPr/>
+        <w:t xml:space="preserve">For Arbeidstaker:</w:t>
+      </w:r>
+    </w:p>
+    <w:p>
+      <w:r>
+        <w:rPr>
+          <w:color w:val="FFFFFF"/>
+        </w:rPr>
+        <w:t xml:space="preserve">[[SIGN_AT]]</w:t>
+      </w:r>
+      <w:r>
+        <w:rPr/>
+        <w:t xml:space="preserve">            </w:t>
+      </w:r>
+      <w:r>
+        <w:rPr>
+          <w:color w:val="FFFFFF"/>
+        </w:rPr>
+        <w:t xml:space="preserve">[[DATO_AT]]</w:t>
       </w:r>
     </w:p>
     <w:sectPr>

</xml_diff>

<commit_message>
Rett opp visuell utfylling av kontrakten
- Datoer fra Excel kom som serienummer (46272) -> normaliserer til ISO ved
  lesing (excelSerialToISO), fikser bade kontrakt og bursdagslogikk. Vises som
  dd.mm.yyyy i kontrakten (formatDateNo).
- Stillingsdel: "%" flyttet inn i verdien og fjernet fra malen (fjerner stor luft).
- Feltverdiene far serif-font (Times New Roman 11) saa de matcher dokumentet.
- Fjernet den kursiverte "Signering settes opp i DocuSign..."-linjen.
- Ny signeringsseksjon med tydelig luft saa signaturen ikke havner oppa teksten.
- Reserverte bredde etter [[NAERMESTE_LEDER]] saa lange titler ikke overlapper
  teksten som folger inline.

Co-Authored-By: Claude Opus 4.8 <noreply@anthropic.com>
</commit_message>
<xml_diff>
--- a/docs/Arbeidsavtale-mal.docx
+++ b/docs/Arbeidsavtale-mal.docx
@@ -597,9 +597,6 @@
               </w:rPr>
               <w:t xml:space="preserve">[[STILLINGSDEL]]</w:t>
             </w:r>
-            <w:r>
-              <w:t xml:space="preserve"> %</w:t>
-            </w:r>
           </w:p>
         </w:tc>
       </w:tr>
@@ -738,6 +735,12 @@
         <w:t xml:space="preserve">[[NAERMESTE_LEDER]]</w:t>
       </w:r>
       <w:r>
+        <w:rPr>
+          <w:color w:val="FFFFFF"/>
+        </w:rPr>
+        <w:t xml:space="preserve">              </w:t>
+      </w:r>
+      <w:r>
         <w:t xml:space="preserve"> eller den som Arbeidsgiver utpeker.</w:t>
       </w:r>
     </w:p>
@@ -1186,19 +1189,6 @@
       </w:pPr>
     </w:p>
     <w:p>
-      <w:pPr>
-        <w:spacing w:after="240"/>
-      </w:pPr>
-      <w:r>
-        <w:rPr>
-          <w:i/>
-          <w:iCs/>
-          <w:color w:val="888888"/>
-        </w:rPr>
-        <w:t xml:space="preserve">Signering settes opp i DocuSign (Sign Here / Date Signed-felt for Arbeidstaker og Daniel Kolstad) — ikke en del av denne malteksten.</w:t>
-      </w:r>
-    </w:p>
-    <w:p>
       <w:r>
         <w:rPr/>
         <w:t xml:space="preserve"/>
@@ -1215,7 +1205,27 @@
     <w:p>
       <w:r>
         <w:rPr/>
-        <w:t xml:space="preserve">For Electi Business Partner AS (Arbeidsgiver):</w:t>
+        <w:t xml:space="preserve"/>
+      </w:r>
+    </w:p>
+    <w:p>
+      <w:r>
+        <w:rPr>
+          <w:b/>
+        </w:rPr>
+        <w:t xml:space="preserve">Arbeidsgiver — Electi Business Partner AS</w:t>
+      </w:r>
+    </w:p>
+    <w:p>
+      <w:r>
+        <w:rPr/>
+        <w:t xml:space="preserve">v/ Daniel Kolstad, Daglig leder</w:t>
+      </w:r>
+    </w:p>
+    <w:p>
+      <w:r>
+        <w:rPr/>
+        <w:t xml:space="preserve"/>
       </w:r>
     </w:p>
     <w:p>
@@ -1225,9 +1235,23 @@
         </w:rPr>
         <w:t xml:space="preserve">[[SIGN_AG]]</w:t>
       </w:r>
+    </w:p>
+    <w:p>
       <w:r>
         <w:rPr/>
-        <w:t xml:space="preserve">            </w:t>
+        <w:t xml:space="preserve"/>
+      </w:r>
+    </w:p>
+    <w:p>
+      <w:r>
+        <w:rPr/>
+        <w:t xml:space="preserve"/>
+      </w:r>
+    </w:p>
+    <w:p>
+      <w:r>
+        <w:rPr/>
+        <w:t xml:space="preserve">Dato: </w:t>
       </w:r>
       <w:r>
         <w:rPr>
@@ -1245,7 +1269,27 @@
     <w:p>
       <w:r>
         <w:rPr/>
-        <w:t xml:space="preserve">For Arbeidstaker:</w:t>
+        <w:t xml:space="preserve"/>
+      </w:r>
+    </w:p>
+    <w:p>
+      <w:r>
+        <w:rPr/>
+        <w:t xml:space="preserve"/>
+      </w:r>
+    </w:p>
+    <w:p>
+      <w:r>
+        <w:rPr>
+          <w:b/>
+        </w:rPr>
+        <w:t xml:space="preserve">Arbeidstaker</w:t>
+      </w:r>
+    </w:p>
+    <w:p>
+      <w:r>
+        <w:rPr/>
+        <w:t xml:space="preserve"/>
       </w:r>
     </w:p>
     <w:p>
@@ -1255,9 +1299,23 @@
         </w:rPr>
         <w:t xml:space="preserve">[[SIGN_AT]]</w:t>
       </w:r>
+    </w:p>
+    <w:p>
       <w:r>
         <w:rPr/>
-        <w:t xml:space="preserve">            </w:t>
+        <w:t xml:space="preserve"/>
+      </w:r>
+    </w:p>
+    <w:p>
+      <w:r>
+        <w:rPr/>
+        <w:t xml:space="preserve"/>
+      </w:r>
+    </w:p>
+    <w:p>
+      <w:r>
+        <w:rPr/>
+        <w:t xml:space="preserve">Dato: </w:t>
       </w:r>
       <w:r>
         <w:rPr>

</xml_diff>

<commit_message>
Mer luft over signaturfeltene i malen (unngaa overlapp med etikett)
Verifisert live ved aa signere en ekte testkonvolutt ende-til-ende: begge
signaturene sitter naa rent under sine etiketter uten overlapp, feltene fylles
med matchende serif-font, "50 %" uten luft, tiltredelsesdato 07.09.2026.

Co-Authored-By: Claude Opus 4.8 <noreply@anthropic.com>
</commit_message>
<xml_diff>
--- a/docs/Arbeidsavtale-mal.docx
+++ b/docs/Arbeidsavtale-mal.docx
@@ -1230,6 +1230,12 @@
     </w:p>
     <w:p>
       <w:r>
+        <w:rPr/>
+        <w:t xml:space="preserve"/>
+      </w:r>
+    </w:p>
+    <w:p>
+      <w:r>
         <w:rPr>
           <w:color w:val="FFFFFF"/>
         </w:rPr>
@@ -1284,6 +1290,12 @@
           <w:b/>
         </w:rPr>
         <w:t xml:space="preserve">Arbeidstaker</w:t>
+      </w:r>
+    </w:p>
+    <w:p>
+      <w:r>
+        <w:rPr/>
+        <w:t xml:space="preserve"/>
       </w:r>
     </w:p>
     <w:p>

</xml_diff>